<commit_message>
Finished User Story 3
</commit_message>
<xml_diff>
--- a/Technical Interview Designs.docx
+++ b/Technical Interview Designs.docx
@@ -214,16 +214,7 @@
         </w:numPr>
       </w:pPr>
       <w:r>
-        <w:t>As a user</w:t>
-      </w:r>
-      <w:r>
-        <w:t xml:space="preserve"> </w:t>
-      </w:r>
-      <w:r>
-        <w:t>I want to create a new loan application</w:t>
-      </w:r>
-      <w:r>
-        <w:t xml:space="preserve"> </w:t>
+        <w:t xml:space="preserve">As a user I want to create a new loan application </w:t>
       </w:r>
       <w:r>
         <w:t>s</w:t>
@@ -390,7 +381,10 @@
         <w:t xml:space="preserve"> saying “Created successfully.”</w:t>
       </w:r>
       <w:r>
-        <w:t xml:space="preserve"> Should then redirect user to dashboard.</w:t>
+        <w:t xml:space="preserve"> </w:t>
+      </w:r>
+      <w:r>
+        <w:t>Should then redirect user to dashboard.</w:t>
       </w:r>
     </w:p>
     <w:p/>
@@ -420,7 +414,7 @@
           <w:noProof/>
         </w:rPr>
         <w:drawing>
-          <wp:inline distT="0" distB="0" distL="0" distR="0" wp14:anchorId="45DA2BB9" wp14:editId="08059768">
+          <wp:inline distT="0" distB="0" distL="0" distR="0" wp14:anchorId="45DA2BB9" wp14:editId="656CB4CF">
             <wp:extent cx="5486400" cy="3154680"/>
             <wp:effectExtent l="0" t="0" r="0" b="0"/>
             <wp:docPr id="1743567487" name="Picture 1743567487" descr="A screenshot of a computer&#10;&#10;AI-generated content may be incorrect."/>
@@ -468,7 +462,7 @@
           <w:noProof/>
         </w:rPr>
         <w:drawing>
-          <wp:inline distT="0" distB="0" distL="0" distR="0" wp14:anchorId="000FEC5C" wp14:editId="598E3351">
+          <wp:inline distT="0" distB="0" distL="0" distR="0" wp14:anchorId="000FEC5C" wp14:editId="2AD26B57">
             <wp:extent cx="5486400" cy="3143250"/>
             <wp:effectExtent l="0" t="0" r="0" b="0"/>
             <wp:docPr id="274711693" name="Picture 274711693" descr="A screenshot of a computer&#10;&#10;AI-generated content may be incorrect."/>
@@ -703,7 +697,7 @@
           <w:noProof/>
         </w:rPr>
         <w:drawing>
-          <wp:inline distT="0" distB="0" distL="0" distR="0" wp14:anchorId="79EF5D38" wp14:editId="31A48CB5">
+          <wp:inline distT="0" distB="0" distL="0" distR="0" wp14:anchorId="79EF5D38" wp14:editId="013A0B5C">
             <wp:extent cx="5486400" cy="2171700"/>
             <wp:effectExtent l="0" t="0" r="0" b="0"/>
             <wp:docPr id="1225850971" name="Picture 1225850971" descr="A screenshot of a computer&#10;&#10;AI-generated content may be incorrect."/>
@@ -1153,7 +1147,7 @@
           <w:noProof/>
         </w:rPr>
         <w:drawing>
-          <wp:inline distT="0" distB="0" distL="0" distR="0" wp14:anchorId="0EED38D0" wp14:editId="05F9548E">
+          <wp:inline distT="0" distB="0" distL="0" distR="0" wp14:anchorId="0EED38D0" wp14:editId="3BA9EEC7">
             <wp:extent cx="5486400" cy="3154680"/>
             <wp:effectExtent l="0" t="0" r="0" b="0"/>
             <wp:docPr id="826157053" name="Picture 826157053" descr="A screenshot of a computer&#10;&#10;AI-generated content may be incorrect."/>
@@ -1201,7 +1195,7 @@
           <w:noProof/>
         </w:rPr>
         <w:drawing>
-          <wp:inline distT="0" distB="0" distL="0" distR="0" wp14:anchorId="22774C5D" wp14:editId="492D716D">
+          <wp:inline distT="0" distB="0" distL="0" distR="0" wp14:anchorId="22774C5D" wp14:editId="3F65B3A7">
             <wp:extent cx="5486400" cy="3166110"/>
             <wp:effectExtent l="0" t="0" r="0" b="0"/>
             <wp:docPr id="246889203" name="Picture 246889203" descr="A screenshot of a computer&#10;&#10;AI-generated content may be incorrect."/>
@@ -1405,7 +1399,7 @@
           <w:noProof/>
         </w:rPr>
         <w:drawing>
-          <wp:inline distT="0" distB="0" distL="0" distR="0" wp14:anchorId="41D89248" wp14:editId="61C31DBF">
+          <wp:inline distT="0" distB="0" distL="0" distR="0" wp14:anchorId="41D89248" wp14:editId="28A0E45E">
             <wp:extent cx="5486400" cy="2171700"/>
             <wp:effectExtent l="0" t="0" r="0" b="0"/>
             <wp:docPr id="1790169272" name="Picture 1790169272" descr="A screenshot of a computer&#10;&#10;AI-generated content may be incorrect."/>
@@ -1454,7 +1448,7 @@
           <w:noProof/>
         </w:rPr>
         <w:drawing>
-          <wp:inline distT="0" distB="0" distL="0" distR="0" wp14:anchorId="799663E4" wp14:editId="155917BC">
+          <wp:inline distT="0" distB="0" distL="0" distR="0" wp14:anchorId="799663E4" wp14:editId="58900872">
             <wp:extent cx="5486400" cy="2171700"/>
             <wp:effectExtent l="0" t="0" r="0" b="0"/>
             <wp:docPr id="403710519" name="Picture 403710519" descr="A screenshot of a computer&#10;&#10;AI-generated content may be incorrect."/>
@@ -5071,6 +5065,7 @@
   <w:style w:type="character" w:default="1" w:styleId="DefaultParagraphFont">
     <w:name w:val="Default Paragraph Font"/>
     <w:uiPriority w:val="1"/>
+    <w:semiHidden/>
     <w:unhideWhenUsed/>
   </w:style>
   <w:style w:type="table" w:default="1" w:styleId="TableNormal">

</xml_diff>